<commit_message>
docs: 2026-06-05 report extended with notebooks 03-04; README headline corrected to full-scale QWK 0.56
Co-Authored-By: Claude Opus 4.8 (1M context) <noreply@anthropic.com>
</commit_message>
<xml_diff>
--- a/docs/JOURNAL.docx
+++ b/docs/JOURNAL.docx
@@ -67,7 +67,19 @@
         <w:t xml:space="preserve">0.647</w:t>
       </w:r>
       <w:r>
-        <w:t xml:space="preserve"> (best so far); five Praat prosody features added nothing at n = 100 — a reported null result, with intensity_sd_db flagged as a likely recording-gain confound. Also caught a CV reproducibility trap: row order silently changes fold assignment (±0.04 QWK at this n). Afternoon: extracted the notebook helpers into a src-layout speechlab package with a 23-test pytest suite on synthetic fixtures only (licence rule) and an equivalence check reproducing notebook 02’s QWK to the third decimal; the tests caught a real MTLD boundary bug. Full-dev transcription (5,616 responses) started via a resumable script. Full detail: docs/session-2026-06-05.md.</w:t>
+        <w:t xml:space="preserve"> (best so far); five Praat prosody features added nothing at n = 100 — a reported null result, with intensity_sd_db flagged as a likely recording-gain confound. Also caught a CV reproducibility trap: row order silently changes fold assignment (±0.04 QWK at this n). Afternoon: extracted the notebook helpers into a src-layout speechlab package with a 23-test pytest suite on synthetic fixtures only (licence rule) and an equivalence check reproducing notebook 02’s QWK to the third decimal; the tests caught a real MTLD boundary bug. Full-dev transcription (5,616 responses) started via a resumable script. Evening: notebooks 03–04 at full scale (876 P3+P4 responses, speaker-grouped CV). Headline corrected: </w:t>
+      </w:r>
+      <w:r>
+        <w:rPr>
+          <w:b/>
+          <w:bCs/>
+          <w:i w:val="false"/>
+          <w:iCs w:val="false"/>
+        </w:rPr>
+        <w:t xml:space="preserve">RF QWK 0.558</w:t>
+      </w:r>
+      <w:r>
+        <w:t xml:space="preserve"> pooled — the n=100 figure (0.647) was small-sample optimism, and the public README now carries the honest number. Speaker leakage measured ≈0; PyTorch MLP an honest null. Error analysis: band 2 over-scored +0.96 / band 5 under-scored −0.70 (scale compression), 81.5% agreement within half a band, and the nb02 ASR-propagation alarm resolved as proficiency mediation (partial r = −0.01). Audio-quality fairness slice flat but thin; per-speaker error tail documented. Full detail: docs/session-2026-06-05.md.</w:t>
       </w:r>
     </w:p>
     <w:p>

</xml_diff>